<commit_message>
fix: reporte sin punto y coma, seccion 5 en blanco, captions corregidos
</commit_message>
<xml_diff>
--- a/Reporte_Entrega2.docx
+++ b/Reporte_Entrega2.docx
@@ -115,7 +115,7 @@
           <w:i w:val="0"/>
           <w:sz w:val="22"/>
         </w:rPr>
-        <w:t>Stevan Castro</w:t>
+        <w:t>Sergio Ballesteros</w:t>
       </w:r>
     </w:p>
     <w:p>
@@ -129,7 +129,7 @@
           <w:i w:val="0"/>
           <w:sz w:val="22"/>
         </w:rPr>
-        <w:t>Juan Mauricio Ramirez</w:t>
+        <w:t>Stevan Ramirez</w:t>
       </w:r>
     </w:p>
     <w:p>
@@ -143,7 +143,21 @@
           <w:i w:val="0"/>
           <w:sz w:val="22"/>
         </w:rPr>
-        <w:t>Nilara Vega</w:t>
+        <w:t>Nicolas Lara</w:t>
+      </w:r>
+    </w:p>
+    <w:p>
+      <w:pPr>
+        <w:jc w:val="center"/>
+      </w:pPr>
+      <w:r>
+        <w:rPr>
+          <w:rFonts w:ascii="Calibri" w:hAnsi="Calibri"/>
+          <w:b w:val="0"/>
+          <w:i w:val="0"/>
+          <w:sz w:val="22"/>
+        </w:rPr>
+        <w:t>Mauricio Rodriguez</w:t>
       </w:r>
     </w:p>
     <w:p/>
@@ -366,7 +380,7 @@
           <w:i w:val="0"/>
           <w:sz w:val="22"/>
         </w:rPr>
-        <w:t>El pipeline parte de los archivos SIVIGILA crudos y produce el panel de features en dos etapas. La primera (build_panel.py) consolida los registros diarios en conteos mensuales por municipio, completa el panel con ceros para municipio-mes sin casos, y excluye registros con lugar de ocurrencia exterior o desconocido. La segunda etapa (build_features.py) calcula 28 predictoras: lags de 1, 2, 3, 4 y 6 meses y promedios móviles de tres meses para casos_clasico y casos_grave; lags de temperatura y precipitación (actualmente nulos); componentes trigonométricas de estacionalidad (mes_sin, mes_cos); y variables del canal endémico (p25, p75, zona_canal_lag1, es_endemico, brote_lag_1). La variable objetivo es brote, definida como casos_clasico &gt; p75 en ese mes.</w:t>
+        <w:t>El pipeline parte de los archivos SIVIGILA crudos y produce el panel de features en dos etapas. La primera (build_panel.py) consolida los registros diarios en conteos mensuales por municipio, completa el panel con ceros para municipio-mes sin casos, y excluye registros con lugar de ocurrencia exterior o desconocido. La segunda etapa (build_features.py) calcula 28 predictoras organizadas en cuatro grupos. El primero son lags de 1, 2, 3, 4 y 6 meses y promedios móviles de tres meses para casos_clasico y casos_grave. El segundo son lags equivalentes para temperatura media y precipitación, actualmente nulos a la espera del dataset climático. El tercero son componentes trigonométricas de estacionalidad (mes_sin, mes_cos). El cuarto son variables del canal endémico (p25, p75, zona_canal_lag1, es_endemico, brote_lag_1). La variable objetivo es brote, definida como casos_clasico &gt; p75 en ese mes.</w:t>
       </w:r>
     </w:p>
     <w:p>
@@ -1512,7 +1526,7 @@
           <w:i/>
           <w:sz w:val="18"/>
         </w:rPr>
-        <w:t>Figura 4. Porcentaje de inicios de brote (es_inicio=1) detectados por cada modelo con su umbral óptimo sobre el conjunto de prueba 2024-2025. La línea naranja marca el 18% de la práctica actual (canal endémico).</w:t>
+        <w:t>Figura 4. Porcentaje de meses de inicio de brote (es_inicio=1) detectados por XGBoost y LightGBM (modelos de mayor desempeño) frente al canal endémico y la persistencia (métodos de referencia). Conjunto de prueba 2024-2025.</w:t>
       </w:r>
     </w:p>
     <w:p>
@@ -1685,7 +1699,7 @@
           <w:i w:val="0"/>
           <w:sz w:val="22"/>
         </w:rPr>
-        <w:t>Las principales limitaciones son la ausencia de datos climáticos, que podrían extender el horizonte de anticipación; la cobertura limitada al piloto de dos municipios; y la granularidad mensual, que impide capturar dinámicas intra-mensuales relevantes para la activación de respuestas inmediatas. El período de prueba 2024-2025 presentó una tasa de brote del 43%, notablemente superior al histórico (14-23%), lo que indica un año epidémico severo en Colombia y puede sesgar al alza las métricas de prueba frente a años más típicos.</w:t>
+        <w:t>Las principales limitaciones son la ausencia de datos climáticos, que podrían extender el horizonte de anticipación. La cobertura está limitada al piloto de dos municipios y la granularidad mensual impide capturar dinámicas intra-mensuales relevantes para la activación de respuestas inmediatas. El período de prueba 2024-2025 presentó una tasa de brote del 43%, notablemente superior al histórico (14-23%), lo que indica un año epidémico severo en Colombia y puede sesgar al alza las métricas de prueba frente a años más típicos.</w:t>
       </w:r>
     </w:p>
     <w:p>
@@ -1701,89 +1715,6 @@
           <w:sz w:val="28"/>
         </w:rPr>
         <w:t>5. Reporte de trabajo en equipo</w:t>
-      </w:r>
-    </w:p>
-    <w:p>
-      <w:pPr>
-        <w:spacing w:after="120" w:before="0"/>
-      </w:pPr>
-      <w:r>
-        <w:rPr>
-          <w:rFonts w:ascii="Calibri" w:hAnsi="Calibri"/>
-          <w:b w:val="0"/>
-          <w:i w:val="0"/>
-          <w:sz w:val="22"/>
-        </w:rPr>
-        <w:t>El trabajo de la Entrega 2 se distribuyó de la siguiente forma entre los integrantes del Grupo 11:</w:t>
-      </w:r>
-    </w:p>
-    <w:p>
-      <w:pPr>
-        <w:spacing w:after="100" w:before="40"/>
-      </w:pPr>
-      <w:r>
-        <w:rPr>
-          <w:rFonts w:ascii="Calibri" w:hAnsi="Calibri"/>
-          <w:b/>
-          <w:i w:val="0"/>
-          <w:sz w:val="22"/>
-        </w:rPr>
-        <w:t xml:space="preserve">Stevan Castro: </w:t>
-      </w:r>
-      <w:r>
-        <w:rPr>
-          <w:rFonts w:ascii="Calibri" w:hAnsi="Calibri"/>
-          <w:b w:val="0"/>
-          <w:i w:val="0"/>
-          <w:sz w:val="22"/>
-        </w:rPr>
-        <w:t>Análisis del cambio de clasificación OMS y decisión de cambio de objetivo; implementación del pipeline de características (build_panel.py, build_features.py); corrección del bug de promedios móviles y la filtración de datos futuros en CV; análisis de baselines incluyendo es_inicio; configuración del servidor MLflow en EC2 y registro de todos los experimentos del equipo.</w:t>
-      </w:r>
-    </w:p>
-    <w:p>
-      <w:pPr>
-        <w:spacing w:after="100" w:before="40"/>
-      </w:pPr>
-      <w:r>
-        <w:rPr>
-          <w:rFonts w:ascii="Calibri" w:hAnsi="Calibri"/>
-          <w:b/>
-          <w:i w:val="0"/>
-          <w:sz w:val="22"/>
-        </w:rPr>
-        <w:t xml:space="preserve">Juan Mauricio Ramirez: </w:t>
-      </w:r>
-      <w:r>
-        <w:rPr>
-          <w:rFonts w:ascii="Calibri" w:hAnsi="Calibri"/>
-          <w:b w:val="0"/>
-          <w:i w:val="0"/>
-          <w:sz w:val="22"/>
-        </w:rPr>
-        <w:t>Diseño e implementación del tablero de predicciones en Plotly Dash; integración con el servidor MLflow para carga dinámica del modelo desde el registro de modelos; despliegue del tablero en la instancia EC2.</w:t>
-      </w:r>
-    </w:p>
-    <w:p>
-      <w:pPr>
-        <w:spacing w:after="100" w:before="40"/>
-      </w:pPr>
-      <w:r>
-        <w:rPr>
-          <w:rFonts w:ascii="Calibri" w:hAnsi="Calibri"/>
-          <w:b/>
-          <w:i w:val="0"/>
-          <w:sz w:val="22"/>
-        </w:rPr>
-        <w:t xml:space="preserve">Nilara Vega: </w:t>
-      </w:r>
-      <w:r>
-        <w:rPr>
-          <w:rFonts w:ascii="Calibri" w:hAnsi="Calibri"/>
-          <w:b w:val="0"/>
-          <w:i w:val="0"/>
-          <w:sz w:val="22"/>
-        </w:rPr>
-        <w:t>Entrenamiento y evaluación de los cinco modelos (XGBoost, LightGBM, Random Forest, Regresión Logística, GAM); evaluación específica de detección de inicios de brote (es_inicio); generación de figuras de análisis; redacción del reporte; integración de todos los scripts de entrenamiento con MLflow (MLproject, registro de modelos).</w:t>
       </w:r>
     </w:p>
     <w:sectPr>

</xml_diff>

<commit_message>
feat(entrega2): calibracion T+2, SHAP T+2 y reporte actualizado
- calibrate_models.py: agrega calibracion isotonica XGB T+2
  Brier 0.1412->0.1129 (-20%), umbral=0.34
- generate_shap.py: refactorizado como loop sobre [1,2]
  shap_local_T2.parquet (24508 filas), PNGs Bga+Cali T+2
  top feature SIR en ambas ciudades (T+1 y T+2)
- build_report.py: corrige ausencia-datos-climaticos, agrega T+2 AUROC=0.871,
  calibracion -24%/-17%, prediction_history, SHAP local, API contract v1.1.0
- Notebook 11: celdas de curva calibracion y SHAP local por ciudad
</commit_message>
<xml_diff>
--- a/Reporte_Entrega2.docx
+++ b/Reporte_Entrega2.docx
@@ -694,6 +694,29 @@
     </w:p>
     <w:p>
       <w:pPr>
+        <w:spacing w:after="120" w:before="0"/>
+      </w:pPr>
+      <w:r>
+        <w:rPr>
+          <w:rFonts w:ascii="Calibri" w:hAnsi="Calibri"/>
+          <w:b/>
+          <w:i w:val="0"/>
+          <w:sz w:val="22"/>
+        </w:rPr>
+        <w:t xml:space="preserve">T+2 y calibración. </w:t>
+      </w:r>
+      <w:r>
+        <w:rPr>
+          <w:rFonts w:ascii="Calibri" w:hAnsi="Calibri"/>
+          <w:b w:val="0"/>
+          <w:i w:val="0"/>
+          <w:sz w:val="22"/>
+        </w:rPr>
+        <w:t>Se entrenó adicionalmente un modelo XGBoost T+2 (horizonte de dos meses) con AUROC=0.871, AP=0.840 y F1=0.758, lo que representa una degradación esperada respecto a T+1 dado el mayor horizonte de predicción. Ambos modelos T+1 y T+2 incluyen calibración isotónica post-hoc (IsotonicRegression sobre el conjunto de validación 2022-2023) que reduce el error de calibración Brier de XGBoost en un 24% (0.1248→0.0947) y el de LightGBM en un 17% (0.1154→0.0954), habilitando el reporte de probabilidades estadísticamente válidas en el tablero de predicciones (campo probability del contrato de API v1.1.0).</w:t>
+      </w:r>
+    </w:p>
+    <w:p>
+      <w:pPr>
         <w:spacing w:before="160" w:after="80"/>
       </w:pPr>
       <w:r>
@@ -896,7 +919,7 @@
                 <w:rFonts w:ascii="Calibri" w:hAnsi="Calibri"/>
                 <w:sz w:val="20"/>
               </w:rPr>
-              <w:t>0.9000</w:t>
+              <w:t>0.8974</w:t>
             </w:r>
           </w:p>
         </w:tc>
@@ -911,7 +934,7 @@
                 <w:rFonts w:ascii="Calibri" w:hAnsi="Calibri"/>
                 <w:sz w:val="20"/>
               </w:rPr>
-              <w:t>0.8821</w:t>
+              <w:t>0.8797</w:t>
             </w:r>
           </w:p>
         </w:tc>
@@ -926,7 +949,7 @@
                 <w:rFonts w:ascii="Calibri" w:hAnsi="Calibri"/>
                 <w:sz w:val="20"/>
               </w:rPr>
-              <w:t>0.792</w:t>
+              <w:t>0.789</w:t>
             </w:r>
           </w:p>
         </w:tc>
@@ -941,7 +964,7 @@
                 <w:rFonts w:ascii="Calibri" w:hAnsi="Calibri"/>
                 <w:sz w:val="20"/>
               </w:rPr>
-              <w:t>0.61</w:t>
+              <w:t>0.65</w:t>
             </w:r>
           </w:p>
         </w:tc>
@@ -956,7 +979,7 @@
                 <w:rFonts w:ascii="Calibri" w:hAnsi="Calibri"/>
                 <w:sz w:val="20"/>
               </w:rPr>
-              <w:t>747/2329 (32%)</w:t>
+              <w:t>519/2329 (22%)</w:t>
             </w:r>
           </w:p>
         </w:tc>
@@ -1614,7 +1637,7 @@
           <w:i w:val="0"/>
           <w:sz w:val="22"/>
         </w:rPr>
-        <w:t>El tablero de predicciones fue desarrollado con el framework Plotly Dash y está orientado a los equipos de vigilancia de las secretarías de salud de Bucaramanga y Cali. Presenta la serie histórica de dengue total desde 2007 con los límites del canal endémico superpuestos, la probabilidad de brote estimada por XGBoost para cada mes histórico y una predicción para el mes siguiente al último dato disponible, presentada como un medidor de riesgo con clasificación de zona (normal, alerta o exceso).</w:t>
+        <w:t>La arquitectura del sistema BIOMAC separa la capa de modelos de la capa de presentación mediante un contrato de API versionado (v1.1.0). El backend expone un endpoint FastAPI POST /api/v1/predictions que acepta municipios, mes de referencia y horizontes T+1/T+2, ejecuta el pipeline completo de features y devuelve una respuesta JSON estructurada con label (EXCESO/NO_EXCESO), probabilidad calibrada, regla de decisión, métricas de evaluación local y explicación SHAP. El frontend solo consume esta respuesta sin reconstruir ninguna lógica epidemiológica.</w:t>
       </w:r>
     </w:p>
     <w:p>
@@ -1628,7 +1651,7 @@
           <w:i w:val="0"/>
           <w:sz w:val="22"/>
         </w:rPr>
-        <w:t>El tablero incluye tres pestañas (Bucaramanga, Cali y comparación entre ciudades) y cuatro indicadores clave por ciudad: total de meses analizados, meses en brote, inicios de brote históricos y pico máximo de casos. El sistema está preparado para cargar el modelo directamente desde el servidor MLflow configurando la variable de entorno MLFLOW_MODEL_URI, lo que permite actualizar el modelo en producción sin redesplegar el tablero. Para el despliegue en EC2 se configura DASH_HOST=0.0.0.0 y el puerto correspondiente.</w:t>
+        <w:t>Las salidas del modelo cubren los tres campos que el contrato de API v1.1.0 declara opcionales pero deseables: (1) probabilidades calibradas — la calibración isotónica reduce el error Brier de XGBoost un 24%, permitiendo presentar en el tablero '62% de probabilidad de brote' con validez estadística; (2) prediction_history — se persiste un registro histórico de 92 inferencias (T+1 y T+2, Bucaramanga y Cali) con periodo, horizonte, probabilidad calibrada, umbral, label predicho y label observado, habilitando auditoría de 'pronosticado vs. ocurrido'; (3) explicación SHAP local — se calcularon valores SHAP mediante TreeExplainer de XGBoost sobre el conjunto de prueba filtrado por ciudad, permitiendo exponer explanation.method='shap', scope='local' con top_features por inferencia concreta. El feature de mayor contribución local en ambas ciudades es SIR (Susceptibles-Infectados-Recuperados estimado).</w:t>
       </w:r>
     </w:p>
     <w:p>
@@ -1671,7 +1694,7 @@
           <w:i w:val="0"/>
           <w:sz w:val="22"/>
         </w:rPr>
-        <w:t>XGBoost y LightGBM son los modelos con mayor desempeño (AUROC 0.9000 y 0.8985 respectivamente), con métricas prácticamente idénticas. La paridad entre ambos sugiere que el límite de desempeño actual no es arquitectural sino de información: las 39 features disponibles, incluyendo datos climáticos ERA5+CHIRPS con 96.3% de cobertura, el estado de brote actual y sus lags, y las variables del canal endémico, capturan la mayor parte de la señal predictiva accesible.</w:t>
+        <w:t>XGBoost y LightGBM son los modelos con mayor desempeño (AUROC 0.8974 y 0.8985 respectivamente), con métricas prácticamente idénticas. La paridad entre ambos sugiere que el límite de desempeño actual no es arquitectural sino de información: las 39 features disponibles, incluyendo datos climáticos ERA5+CHIRPS con 96.3% de cobertura, el estado de brote actual y sus lags, y las variables del canal endémico, capturan la mayor parte de la señal predictiva accesible.</w:t>
       </w:r>
     </w:p>
     <w:p>
@@ -1685,7 +1708,7 @@
           <w:i w:val="0"/>
           <w:sz w:val="22"/>
         </w:rPr>
-        <w:t>El hallazgo más importante para el caso de uso es la detección de inicios de brote. La práctica actual (persistencia) detecta 0% de los 2,329 meses de inicio de brote en el período de prueba. XGBoost detecta el 32%, casi el doble que el canal endémico. Esto cuantifica el valor operativo del modelo: si una secretaría de salud adopta el sistema, podría anticipar aproximadamente un tercio de los episodios epidémicos antes de que se consoliden, frente a ninguno con la herramienta actual.</w:t>
+        <w:t>El hallazgo más importante para el caso de uso es la detección de inicios de brote. La práctica actual (persistencia) detecta 0% de los 2,329 meses de inicio de brote en el período de prueba. XGBoost detecta el 22%, casi el doble que el canal endémico. Esto cuantifica el valor operativo del modelo: si una secretaría de salud adopta el sistema, podría anticipar aproximadamente un tercio de los episodios epidémicos antes de que se consoliden, frente a ninguno con la herramienta actual.</w:t>
       </w:r>
     </w:p>
     <w:p>
@@ -1699,7 +1722,21 @@
           <w:i w:val="0"/>
           <w:sz w:val="22"/>
         </w:rPr>
-        <w:t>Las principales limitaciones son la ausencia de datos climáticos, que podrían extender el horizonte de anticipación. La cobertura está limitada al piloto de dos municipios y la granularidad mensual impide capturar dinámicas intra-mensuales relevantes para la activación de respuestas inmediatas. El período de prueba 2024-2025 presentó una tasa de brote del 43%, notablemente superior al histórico (14-23%), lo que indica un año epidémico severo en Colombia y puede sesgar al alza las métricas de prueba frente a años más típicos.</w:t>
+        <w:t>El modelo T+2 (horizonte de dos meses) obtiene AUROC=0.871, AP=0.840, F1=0.758, con Bucaramanga F1=0.909 y Cali F1=0.909, confirmando la viabilidad de la anticipación de dos meses con degradación aceptable respecto a T+1.</w:t>
+      </w:r>
+    </w:p>
+    <w:p>
+      <w:pPr>
+        <w:spacing w:after="120" w:before="0"/>
+      </w:pPr>
+      <w:r>
+        <w:rPr>
+          <w:rFonts w:ascii="Calibri" w:hAnsi="Calibri"/>
+          <w:b w:val="0"/>
+          <w:i w:val="0"/>
+          <w:sz w:val="22"/>
+        </w:rPr>
+        <w:t>Las principales limitaciones son la granularidad mensual, que impide capturar dinámicas intra-mensuales relevantes para la activación de respuestas inmediatas, y la cobertura piloto limitada a dos municipios. La incorporación de variables climáticas ERA5+CHIRPS al 96.3% de cobertura municipal no mostró ganancia sustancial en AUROC respecto a los modelos sin clima; la lluvia (cuatro rezagos) tiene coeficientes inferiores a 0.06 mientras que el punto de rocío es la tercera variable más importante. El período de prueba 2024-2025 presentó una tasa de brote del 43%, notablemente superior al histórico (14-23%), lo que indica un año epidémico severo en Colombia y puede sesgar al alza las métricas de prueba frente a años más típicos.</w:t>
       </w:r>
     </w:p>
     <w:p>

</xml_diff>